<commit_message>
Atualiza manuais com fluxo Sebastian-Claude
</commit_message>
<xml_diff>
--- a/docs/MANUAL-CRIACAO-REGRAS-MAPEAMENTO-IFC.docx
+++ b/docs/MANUAL-CRIACAO-REGRAS-MAPEAMENTO-IFC.docx
@@ -66,7 +66,7 @@
           <w:color w:val="56666A"/>
           <w:sz w:val="19"/>
         </w:rPr>
-        <w:t>Versão 1.0  •  Julho de 2026</w:t>
+        <w:t>Versão 1.1  •  Julho de 2026</w:t>
       </w:r>
     </w:p>
     <w:p>
@@ -368,7 +368,9 @@
             <w:pPr>
               <w:spacing w:after="0" w:line="264" w:lineRule="auto"/>
             </w:pPr>
-            <w:r/>
+            <w:r>
+              <w:t>Pré e pós-validação de categoria, Export As, classe IFC e PredefinedType, com solicitação controlada de ajustes no Revit</w:t>
+            </w:r>
             <w:r>
               <w:rPr>
                 <w:rFonts w:ascii="Calibri" w:hAnsi="Calibri"/>
@@ -376,7 +378,6 @@
                 <w:color w:val="172124"/>
                 <w:sz w:val="18"/>
               </w:rPr>
-              <w:t>Pré e pós-validação de categoria, Export As, classe IFC e PredefinedType</w:t>
             </w:r>
           </w:p>
         </w:tc>
@@ -424,7 +425,9 @@
             <w:pPr>
               <w:spacing w:after="0" w:line="264" w:lineRule="auto"/>
             </w:pPr>
-            <w:r/>
+            <w:r>
+              <w:t>Alteração autônoma ou não aprovada do Revit/IFC; armazenamento de resultados de validação no Notion</w:t>
+            </w:r>
             <w:r>
               <w:rPr>
                 <w:rFonts w:ascii="Calibri" w:hAnsi="Calibri"/>
@@ -432,7 +435,6 @@
                 <w:color w:val="172124"/>
                 <w:sz w:val="18"/>
               </w:rPr>
-              <w:t>Alteração automática de Revit/IFC ou armazenamento de resultados no Notion</w:t>
             </w:r>
           </w:p>
         </w:tc>
@@ -2415,7 +2417,7 @@
     </w:p>
     <w:p>
       <w:r>
-        <w:t>Para cada classe permitida, liste os valores aceitos pela enumeração daquela classe e schema. Depois restrinja a lista ao caso de uso do projeto.</w:t>
+        <w:t>Para cada classe permitida, confirme primeiro se a entidade aplicável possui PredefinedType no schema e no nível de ocorrência/tipo analisado. Quando existir, liste somente os valores aceitos pela enumeração e restrinja-os ao caso de uso. Quando não existir — situação possível no IFC2X3 — registre que o campo não se aplica e não invente valor.</w:t>
       </w:r>
     </w:p>
     <w:tbl>
@@ -2534,7 +2536,7 @@
     </w:p>
     <w:p>
       <w:r>
-        <w:t>Configure explicit_export_as, explicit_predefined_type e allow_not_defined. Esses campos controlam o que é incompleto e o que pode depender do padrão do exportador.</w:t>
+        <w:t>Configure explicit_export_as, explicit_predefined_type e allow_not_defined. Use explicit_predefined_type somente quando o PredefinedType existir e for aplicável à classe e ao nível analisado no schema escolhido.</w:t>
       </w:r>
     </w:p>
     <w:p>
@@ -3692,7 +3694,9 @@
             <w:pPr>
               <w:spacing w:after="0" w:line="264" w:lineRule="auto"/>
             </w:pPr>
-            <w:r/>
+            <w:r>
+              <w:t>Lista de valores aceitos para a classe; use lista vazia quando PredefinedType não for aplicável no schema e documente a decisão.</w:t>
+            </w:r>
             <w:r>
               <w:rPr>
                 <w:rFonts w:ascii="Calibri" w:hAnsi="Calibri"/>
@@ -3700,7 +3704,6 @@
                 <w:color w:val="172124"/>
                 <w:sz w:val="18"/>
               </w:rPr>
-              <w:t>Lista de valores aceitos para a classe.</w:t>
             </w:r>
           </w:p>
         </w:tc>
@@ -3861,7 +3864,9 @@
             <w:pPr>
               <w:spacing w:after="0" w:line="264" w:lineRule="auto"/>
             </w:pPr>
-            <w:r/>
+            <w:r>
+              <w:t>true para exigir PredefinedType explícito na origem, somente quando suportado e aplicável no schema.</w:t>
+            </w:r>
             <w:r>
               <w:rPr>
                 <w:rFonts w:ascii="Calibri" w:hAnsi="Calibri"/>
@@ -3869,7 +3874,6 @@
                 <w:color w:val="172124"/>
                 <w:sz w:val="18"/>
               </w:rPr>
-              <w:t>true para exigir PredefinedType explícito na origem.</w:t>
             </w:r>
           </w:p>
         </w:tc>
@@ -7535,6 +7539,469 @@
     <w:p>
       <w:r>
         <w:t>Uma matriz está pronta quando um revisor independente consegue responder, para cada regra: qual caso de uso a justifica, qual população ela seleciona, quais resultados são permitidos, quais evidências serão verificadas e quem aprovou a decisão.</w:t>
+      </w:r>
+    </w:p>
+    <w:p>
+      <w:r>
+        <w:br w:type="page"/>
+      </w:r>
+    </w:p>
+    <w:p>
+      <w:pPr>
+        <w:pStyle w:val="Heading1"/>
+        <w:keepNext/>
+      </w:pPr>
+      <w:r>
+        <w:t>17. Fluxo definitivo — Sebastian e Claude no Revit de produção</w:t>
+      </w:r>
+    </w:p>
+    <w:p>
+      <w:r>
+        <w:rPr>
+          <w:b/>
+        </w:rPr>
+        <w:t xml:space="preserve">PRINCÍPIO DE CONTROLE  </w:t>
+      </w:r>
+      <w:r>
+        <w:t>Sebastian realiza a análise conceitual e formaliza a solicitação. Claude trabalha sempre na versão de produção do Revit, mas só pode modificá-la após aprovação humana explícita vinculada à solicitação.</w:t>
+      </w:r>
+    </w:p>
+    <w:p>
+      <w:pPr>
+        <w:pStyle w:val="Heading2"/>
+      </w:pPr>
+      <w:r>
+        <w:t>17.1 Papéis e limites</w:t>
+      </w:r>
+    </w:p>
+    <w:tbl>
+      <w:tblPr>
+        <w:tblStyle w:val="TableGrid"/>
+        <w:tblW w:type="auto" w:w="0"/>
+        <w:tblLook w:firstColumn="1" w:firstRow="1" w:lastColumn="0" w:lastRow="0" w:noHBand="0" w:noVBand="1" w:val="04A0"/>
+      </w:tblPr>
+      <w:tblGrid>
+        <w:gridCol w:w="3120"/>
+        <w:gridCol w:w="3120"/>
+        <w:gridCol w:w="3120"/>
+      </w:tblGrid>
+      <w:tr>
+        <w:tc>
+          <w:tcPr>
+            <w:tcW w:type="dxa" w:w="3120"/>
+            <w:shd w:fill="17365D"/>
+            <w:vAlign w:val="center"/>
+          </w:tcPr>
+          <w:p>
+            <w:pPr>
+              <w:spacing w:after="0"/>
+            </w:pPr>
+            <w:r/>
+            <w:r>
+              <w:rPr>
+                <w:b/>
+                <w:color w:val="FFFFFF"/>
+                <w:sz w:val="18"/>
+              </w:rPr>
+              <w:t>Papel</w:t>
+            </w:r>
+          </w:p>
+        </w:tc>
+        <w:tc>
+          <w:tcPr>
+            <w:tcW w:type="dxa" w:w="3120"/>
+            <w:shd w:fill="17365D"/>
+            <w:vAlign w:val="center"/>
+          </w:tcPr>
+          <w:p>
+            <w:pPr>
+              <w:spacing w:after="0"/>
+            </w:pPr>
+            <w:r/>
+            <w:r>
+              <w:rPr>
+                <w:b/>
+                <w:color w:val="FFFFFF"/>
+                <w:sz w:val="18"/>
+              </w:rPr>
+              <w:t>Responsabilidade</w:t>
+            </w:r>
+          </w:p>
+        </w:tc>
+        <w:tc>
+          <w:tcPr>
+            <w:tcW w:type="dxa" w:w="3120"/>
+            <w:shd w:fill="17365D"/>
+            <w:vAlign w:val="center"/>
+          </w:tcPr>
+          <w:p>
+            <w:pPr>
+              <w:spacing w:after="0"/>
+            </w:pPr>
+            <w:r/>
+            <w:r>
+              <w:rPr>
+                <w:b/>
+                <w:color w:val="FFFFFF"/>
+                <w:sz w:val="18"/>
+              </w:rPr>
+              <w:t>Limite</w:t>
+            </w:r>
+          </w:p>
+        </w:tc>
+      </w:tr>
+      <w:tr>
+        <w:tc>
+          <w:tcPr>
+            <w:tcW w:type="dxa" w:w="3120"/>
+            <w:vAlign w:val="center"/>
+          </w:tcPr>
+          <w:p>
+            <w:pPr>
+              <w:spacing w:after="0"/>
+            </w:pPr>
+            <w:r/>
+            <w:r>
+              <w:rPr>
+                <w:b w:val="0"/>
+                <w:sz w:val="18"/>
+              </w:rPr>
+              <w:t>Sebastian</w:t>
+            </w:r>
+          </w:p>
+        </w:tc>
+        <w:tc>
+          <w:tcPr>
+            <w:tcW w:type="dxa" w:w="3120"/>
+            <w:vAlign w:val="center"/>
+          </w:tcPr>
+          <w:p>
+            <w:pPr>
+              <w:spacing w:after="0"/>
+            </w:pPr>
+            <w:r/>
+            <w:r>
+              <w:rPr>
+                <w:b w:val="0"/>
+                <w:sz w:val="18"/>
+              </w:rPr>
+              <w:t>Analisar requisito, schema IFC, categoria autoral, classe, PredefinedType e parâmetros; emitir a solicitação formal; validar o IFC exportado.</w:t>
+            </w:r>
+          </w:p>
+        </w:tc>
+        <w:tc>
+          <w:tcPr>
+            <w:tcW w:type="dxa" w:w="3120"/>
+            <w:vAlign w:val="center"/>
+          </w:tcPr>
+          <w:p>
+            <w:pPr>
+              <w:spacing w:after="0"/>
+            </w:pPr>
+            <w:r/>
+            <w:r>
+              <w:rPr>
+                <w:b w:val="0"/>
+                <w:sz w:val="18"/>
+              </w:rPr>
+              <w:t>Não altera o modelo Revit.</w:t>
+            </w:r>
+          </w:p>
+        </w:tc>
+      </w:tr>
+      <w:tr>
+        <w:tc>
+          <w:tcPr>
+            <w:tcW w:type="dxa" w:w="3120"/>
+            <w:vAlign w:val="center"/>
+          </w:tcPr>
+          <w:p>
+            <w:pPr>
+              <w:spacing w:after="0"/>
+            </w:pPr>
+            <w:r/>
+            <w:r>
+              <w:rPr>
+                <w:b w:val="0"/>
+                <w:sz w:val="18"/>
+              </w:rPr>
+              <w:t>Claude</w:t>
+            </w:r>
+          </w:p>
+        </w:tc>
+        <w:tc>
+          <w:tcPr>
+            <w:tcW w:type="dxa" w:w="3120"/>
+            <w:vAlign w:val="center"/>
+          </w:tcPr>
+          <w:p>
+            <w:pPr>
+              <w:spacing w:after="0"/>
+            </w:pPr>
+            <w:r/>
+            <w:r>
+              <w:rPr>
+                <w:b w:val="0"/>
+                <w:sz w:val="18"/>
+              </w:rPr>
+              <w:t>Inspecionar o modelo de produção, avaliar impacto, executar somente o escopo aprovado, registrar alterações e exportar o IFC.</w:t>
+            </w:r>
+          </w:p>
+        </w:tc>
+        <w:tc>
+          <w:tcPr>
+            <w:tcW w:type="dxa" w:w="3120"/>
+            <w:vAlign w:val="center"/>
+          </w:tcPr>
+          <w:p>
+            <w:pPr>
+              <w:spacing w:after="0"/>
+            </w:pPr>
+            <w:r/>
+            <w:r>
+              <w:rPr>
+                <w:b w:val="0"/>
+                <w:sz w:val="18"/>
+              </w:rPr>
+              <w:t>Não modifica antes da aprovação explícita e não amplia o escopo.</w:t>
+            </w:r>
+          </w:p>
+        </w:tc>
+      </w:tr>
+      <w:tr>
+        <w:tc>
+          <w:tcPr>
+            <w:tcW w:type="dxa" w:w="3120"/>
+            <w:vAlign w:val="center"/>
+          </w:tcPr>
+          <w:p>
+            <w:pPr>
+              <w:spacing w:after="0"/>
+            </w:pPr>
+            <w:r/>
+            <w:r>
+              <w:rPr>
+                <w:b w:val="0"/>
+                <w:sz w:val="18"/>
+              </w:rPr>
+              <w:t>Responsável humano</w:t>
+            </w:r>
+          </w:p>
+        </w:tc>
+        <w:tc>
+          <w:tcPr>
+            <w:tcW w:type="dxa" w:w="3120"/>
+            <w:vAlign w:val="center"/>
+          </w:tcPr>
+          <w:p>
+            <w:pPr>
+              <w:spacing w:after="0"/>
+            </w:pPr>
+            <w:r/>
+            <w:r>
+              <w:rPr>
+                <w:b w:val="0"/>
+                <w:sz w:val="18"/>
+              </w:rPr>
+              <w:t>Revisar impacto, conflitos e recuperação; aprovar, rejeitar ou pedir ajuste.</w:t>
+            </w:r>
+          </w:p>
+        </w:tc>
+        <w:tc>
+          <w:tcPr>
+            <w:tcW w:type="dxa" w:w="3120"/>
+            <w:vAlign w:val="center"/>
+          </w:tcPr>
+          <w:p>
+            <w:pPr>
+              <w:spacing w:after="0"/>
+            </w:pPr>
+            <w:r/>
+            <w:r>
+              <w:rPr>
+                <w:b w:val="0"/>
+                <w:sz w:val="18"/>
+              </w:rPr>
+              <w:t>A aprovação deve identificar a solicitação e sua revisão.</w:t>
+            </w:r>
+          </w:p>
+        </w:tc>
+      </w:tr>
+    </w:tbl>
+    <w:p>
+      <w:pPr>
+        <w:pStyle w:val="Heading2"/>
+      </w:pPr>
+      <w:r>
+        <w:t>17.2 Sequência operacional</w:t>
+      </w:r>
+    </w:p>
+    <w:p>
+      <w:pPr>
+        <w:pStyle w:val="ListNumber"/>
+        <w:spacing w:after="80"/>
+      </w:pPr>
+      <w:r>
+        <w:t>Sebastian recebe o requisito e fixa o schema, o caso de uso e o critério de aceitação.</w:t>
+      </w:r>
+    </w:p>
+    <w:p>
+      <w:pPr>
+        <w:pStyle w:val="ListNumber"/>
+        <w:spacing w:after="80"/>
+      </w:pPr>
+      <w:r>
+        <w:t>Sebastian verifica fontes oficiais e evidências determinísticas, identifica lacunas e prepara a Solicitação de Modificação Revit (SMR).</w:t>
+      </w:r>
+    </w:p>
+    <w:p>
+      <w:pPr>
+        <w:pStyle w:val="ListNumber"/>
+        <w:spacing w:after="80"/>
+      </w:pPr>
+      <w:r>
+        <w:t>Claude abre a versão de produção somente para inspeção em modo não modificador e informa impacto, dependências, conflitos e forma de recuperação.</w:t>
+      </w:r>
+    </w:p>
+    <w:p>
+      <w:pPr>
+        <w:pStyle w:val="ListNumber"/>
+        <w:spacing w:after="80"/>
+      </w:pPr>
+      <w:r>
+        <w:t>O responsável humano aprova, rejeita ou solicita revisão. Silêncio, aprovação genérica ou conversa anterior não constituem autorização.</w:t>
+      </w:r>
+    </w:p>
+    <w:p>
+      <w:pPr>
+        <w:pStyle w:val="ListNumber"/>
+        <w:spacing w:after="80"/>
+      </w:pPr>
+      <w:r>
+        <w:t>Claude executa somente a revisão aprovada da SMR, sem mudanças colaterais, e registra cada objeto, parâmetro e configuração alterados.</w:t>
+      </w:r>
+    </w:p>
+    <w:p>
+      <w:pPr>
+        <w:pStyle w:val="ListNumber"/>
+        <w:spacing w:after="80"/>
+      </w:pPr>
+      <w:r>
+        <w:t>Claude salva conforme a política vigente do projeto, exporta o IFC no schema solicitado e entrega o relatório de execução com os artefatos.</w:t>
+      </w:r>
+    </w:p>
+    <w:p>
+      <w:pPr>
+        <w:pStyle w:val="ListNumber"/>
+        <w:spacing w:after="80"/>
+      </w:pPr>
+      <w:r>
+        <w:t>Sebastian verifica o IFC exportado contra a categoria autoral, Export As, classe IFC, PredefinedType aplicável, parâmetros e regras aprovadas.</w:t>
+      </w:r>
+    </w:p>
+    <w:p>
+      <w:pPr>
+        <w:pStyle w:val="ListNumber"/>
+        <w:spacing w:after="80"/>
+      </w:pPr>
+      <w:r>
+        <w:t>O responsável humano decide o aceite final. Não conformidades geram nova revisão da SMR; não autorizam correção implícita.</w:t>
+      </w:r>
+    </w:p>
+    <w:p>
+      <w:pPr>
+        <w:pStyle w:val="Heading2"/>
+      </w:pPr>
+      <w:r>
+        <w:t>17.3 Conteúdo mínimo da SMR</w:t>
+      </w:r>
+    </w:p>
+    <w:p>
+      <w:pPr>
+        <w:pStyle w:val="ListBullet"/>
+      </w:pPr>
+      <w:r>
+        <w:t>request_id único, revisão, data, solicitante e modelo/versão de produção alvo;</w:t>
+      </w:r>
+    </w:p>
+    <w:p>
+      <w:pPr>
+        <w:pStyle w:val="ListBullet"/>
+      </w:pPr>
+      <w:r>
+        <w:t>schema IFC, versão do exportador e caso de uso/IDM;</w:t>
+      </w:r>
+    </w:p>
+    <w:p>
+      <w:pPr>
+        <w:pStyle w:val="ListBullet"/>
+      </w:pPr>
+      <w:r>
+        <w:t>elementos ou população alvo: categoria, família, tipo e identificadores disponíveis;</w:t>
+      </w:r>
+    </w:p>
+    <w:p>
+      <w:pPr>
+        <w:pStyle w:val="ListBullet"/>
+      </w:pPr>
+      <w:r>
+        <w:t>estado atual e estado proposto para categoria, Export to IFC As/IfcExportAs, IFC Predefined Type/IfcExportType e parâmetros;</w:t>
+      </w:r>
+    </w:p>
+    <w:p>
+      <w:pPr>
+        <w:pStyle w:val="ListBullet"/>
+      </w:pPr>
+      <w:r>
+        <w:t>justificativa, fonte, evidência determinística e critério de aceitação;</w:t>
+      </w:r>
+    </w:p>
+    <w:p>
+      <w:pPr>
+        <w:pStyle w:val="ListBullet"/>
+      </w:pPr>
+      <w:r>
+        <w:t>impacto esperado, riscos, dependências, plano de recuperação e artefatos de saída;</w:t>
+      </w:r>
+    </w:p>
+    <w:p>
+      <w:pPr>
+        <w:pStyle w:val="ListBullet"/>
+      </w:pPr>
+      <w:r>
+        <w:t>status da aprovação, responsável, data e escopo exato autorizado.</w:t>
+      </w:r>
+    </w:p>
+    <w:p>
+      <w:pPr>
+        <w:pStyle w:val="Heading2"/>
+      </w:pPr>
+      <w:r>
+        <w:t>17.4 Regra de aprovação e execução</w:t>
+      </w:r>
+    </w:p>
+    <w:p>
+      <w:r>
+        <w:rPr>
+          <w:b/>
+        </w:rPr>
+        <w:t xml:space="preserve">BLOQUEIO OBRIGATÓRIO  </w:t>
+      </w:r>
+      <w:r>
+        <w:t>Antes da aprovação explícita, Claude pode apenas inspecionar e relatar. A autorização vale exclusivamente para o request_id, a revisão, o modelo e o escopo aprovados. Qualquer divergência material interrompe a execução e exige nova aprovação.</w:t>
+      </w:r>
+    </w:p>
+    <w:p>
+      <w:pPr>
+        <w:pStyle w:val="Heading2"/>
+      </w:pPr>
+      <w:r>
+        <w:t>17.5 Retorno e validação</w:t>
+      </w:r>
+    </w:p>
+    <w:p>
+      <w:r>
+        <w:t>O retorno de Claude deve informar request_id e revisão, arquivo e versão efetivamente usados, alterações executadas, itens não executados, alertas, caminho do IFC exportado e registro de recuperação. Sebastian usa esse retorno e o IFC como evidência para a pós-validação; conformidade só é declarada após revisão humana.</w:t>
       </w:r>
     </w:p>
     <w:sectPr>

</xml_diff>